<commit_message>
Added Science-researching work 2.1
</commit_message>
<xml_diff>
--- a/ППННИР/1.1 Логика.docx
+++ b/ППННИР/1.1 Логика.docx
@@ -19,66 +19,145 @@
     </w:p>
     <w:p>
       <w:r>
-        <w:t>В современном мире, сплошь переполненным информацией, которая необходима в принятии решений в разных отраслях. Информация накапливается, её необходимо хранить в каком-то месте, но места на внешних накопителях не всегда хватает. Использование современных технологий в формате облачных хранилищ способствует не только освобождению памяти, но и снижению сложности работы информационных систем.</w:t>
+        <w:t xml:space="preserve">Раскрытие логики научного исследования требует определение базовых понятий. </w:t>
+      </w:r>
+      <w:r>
+        <w:t xml:space="preserve">Наука – познавательная деятельность, направленная на приобретение новых знаний. </w:t>
+      </w:r>
+      <w:r>
+        <w:t>Её неотъемлемой частью является н</w:t>
+      </w:r>
+      <w:r>
+        <w:t>аучное исследование – процесс познания, направленный на выявление свойств, архитектуры и закономерностей объекта изучения, чтобы в дальнейшем создать инновационное решение, а также внедрение в реальные кейсы.</w:t>
+      </w:r>
+      <w:r>
+        <w:t xml:space="preserve"> </w:t>
+      </w:r>
+      <w:r>
+        <w:t>Процесс исследования строится на принципах проектно-технологического типа организации научной деятельности, включающий три ключевых фазы</w:t>
+      </w:r>
+      <w:r>
+        <w:rPr>
+          <w:lang w:val="en-US"/>
+        </w:rPr>
+        <w:t> </w:t>
+      </w:r>
+      <w:r>
+        <w:t>[1]</w:t>
+      </w:r>
+      <w:r>
+        <w:t>:</w:t>
       </w:r>
     </w:p>
     <w:p>
-      <w:r>
-        <w:t>Развитие облачных технологий открыло подходы к проектированию и масштабированию инфраструктуры, позволяя оптимизировать вычислительные процессы, что и делает актуальным исследование современных методов и архитектурных решений, применяемых при реализации облачных хранилищ.</w:t>
+      <w:pPr>
+        <w:pStyle w:val="a0"/>
+      </w:pPr>
+      <w:r>
+        <w:t>Проектирование</w:t>
+      </w:r>
+      <w:r>
+        <w:t xml:space="preserve"> начинается с </w:t>
+      </w:r>
+      <w:r>
+        <w:t>определени</w:t>
+      </w:r>
+      <w:r>
+        <w:t>я</w:t>
+      </w:r>
+      <w:r>
+        <w:t xml:space="preserve"> проблемы,</w:t>
+      </w:r>
+      <w:r>
+        <w:t xml:space="preserve"> понимаемой как «знание о незнании», то есть осознание того, чего именно не хватает науке. Затем исследуется</w:t>
+      </w:r>
+      <w:r>
+        <w:t xml:space="preserve"> объект,</w:t>
+      </w:r>
+      <w:r>
+        <w:t xml:space="preserve"> то есть процесс или явление, порождающее проблемную ситуацию. П</w:t>
+      </w:r>
+      <w:r>
+        <w:t>редмета</w:t>
+      </w:r>
+      <w:r>
+        <w:t xml:space="preserve"> является уже </w:t>
+      </w:r>
+      <w:r>
+        <w:t>конкретным свойством, служащим источником выводов.</w:t>
+      </w:r>
+      <w:r>
+        <w:t xml:space="preserve"> </w:t>
+      </w:r>
+      <w:r>
+        <w:t xml:space="preserve">Исследуя различные темы, задаются </w:t>
+      </w:r>
+      <w:r>
+        <w:t>цели исследования</w:t>
+      </w:r>
+      <w:r>
+        <w:t>, обозначающие предположительный результат, для достижения которого</w:t>
+      </w:r>
+      <w:r>
+        <w:t xml:space="preserve"> </w:t>
+      </w:r>
+      <w:r>
+        <w:t>выдвигаются</w:t>
+      </w:r>
+      <w:r>
+        <w:t xml:space="preserve"> гипотезы</w:t>
+      </w:r>
+      <w:r>
+        <w:t>, то есть научные предположения, объясняющие явления, систематизирующие факты</w:t>
+      </w:r>
+      <w:r>
+        <w:t xml:space="preserve">. </w:t>
+      </w:r>
+      <w:r>
+        <w:t>Выдвижение гипотезы проходит в три этапа: накопление фактов и выдвижение допущений, их обоснование и, заключительно, выдвижение гипотезы. Если практически она подтверждается, то она превращается в научное знание, иначе отвергается.</w:t>
+      </w:r>
+      <w:r>
+        <w:t xml:space="preserve"> </w:t>
       </w:r>
     </w:p>
     <w:p>
-      <w:r>
-        <w:t>Объектом исследования является процессы разработки и функционирования облачных систем.</w:t>
-      </w:r>
-      <w:r>
-        <w:t xml:space="preserve"> </w:t>
-      </w:r>
-      <w:r>
-        <w:t>Предметом, в свою очередь, являются современные подходы, технологии архитектуры решения</w:t>
-      </w:r>
-      <w:r>
-        <w:t>.</w:t>
+      <w:pPr>
+        <w:pStyle w:val="a0"/>
+      </w:pPr>
+      <w:r>
+        <w:t>Технологическая: сбор, систематизация, анализ данных о подходах реализации облачных хранилищ, определяется их эффективность, уязвимость, надежность.</w:t>
+      </w:r>
+      <w:r>
+        <w:t xml:space="preserve"> Подразумевается всестороннее изучение подходов к реализации продукта: оценивание архитектуры, эффективности работы, показателей надёжности и потенциальных уязвимостей путём практических методов, используя различные методики для получения первичных данных. Результатом являются достоверные результаты, служащие основанием для подтверждения или опровержения гипотезы.</w:t>
       </w:r>
     </w:p>
     <w:p>
-      <w:r>
-        <w:t xml:space="preserve">Целью исследования является анализ современных подходов к построению облачных хранилищ, выявление их преимуществ и недостатков, перспективы их развития. </w:t>
+      <w:pPr>
+        <w:pStyle w:val="a0"/>
+      </w:pPr>
+      <w:r>
+        <w:lastRenderedPageBreak/>
+        <w:t xml:space="preserve">Рефлексивная: оценивание полученных сведений, формирование выводов и рекомендаций касаемо развития облачных технологий. </w:t>
+      </w:r>
+      <w:r>
+        <w:t xml:space="preserve">На данном этапе проводятся анализ, устанавливающий, достигнута ли цель работы, </w:t>
+      </w:r>
+      <w:r>
+        <w:t xml:space="preserve">подтверждена ли гипотеза, соответствие выводов к поставленной цели. </w:t>
       </w:r>
     </w:p>
     <w:p>
       <w:r>
-        <w:t>Логика исследования строится на переходе от изучения теоретических основ облачных хранилищ к анализу подходов их реализации. А именно понятие самих облачных хранилищ, их историю развития, затем переходим к подходам реализации, уже существующим и формирующимся, в конце проведение анализа, выявление преимуществ и недостатков.</w:t>
-      </w:r>
-    </w:p>
-    <w:p>
-      <w:r>
-        <w:t>Процесс исследования строится на принципах проектно-технологического типа организации научной деятельности, включающий три ключевых фазы:</w:t>
-      </w:r>
-    </w:p>
-    <w:p>
-      <w:pPr>
-        <w:pStyle w:val="a0"/>
-      </w:pPr>
-      <w:r>
-        <w:t>Проектирование: определение объекта, предмета и цели исследования. Изучение теоретических сведений, формирование подходов изучения.</w:t>
-      </w:r>
-    </w:p>
-    <w:p>
-      <w:pPr>
-        <w:pStyle w:val="a0"/>
-      </w:pPr>
-      <w:r>
-        <w:lastRenderedPageBreak/>
-        <w:t>Технологическая: сбор, систематизация, анализ данных о подходах реализации облачных хранилищ, определяется их эффективность, уязвимость, надежность.</w:t>
-      </w:r>
-    </w:p>
-    <w:p>
-      <w:pPr>
-        <w:pStyle w:val="a0"/>
-      </w:pPr>
-      <w:r>
-        <w:t xml:space="preserve">Рефлексивная: оценивание полученных сведений, формирование выводов и рекомендаций касаемо развития облачных технологий. </w:t>
+        <w:t>Основой любого исследования является следование определённой логике, то есть следование чёткой последовательности этапов, обеспечивающая движение от постановки проблемы к получению научного результат</w:t>
+      </w:r>
+      <w:r>
+        <w:rPr>
+          <w:lang w:val="en-US"/>
+        </w:rPr>
+        <w:t> </w:t>
+      </w:r>
+      <w:r>
+        <w:t>[1].</w:t>
       </w:r>
     </w:p>
     <w:p>
@@ -105,13 +184,17 @@
       <w:r>
         <w:t xml:space="preserve">Новиков, А. М. Методология научного </w:t>
       </w:r>
-      <w:proofErr w:type="gramStart"/>
-      <w:r>
-        <w:t>исследования :</w:t>
-      </w:r>
-      <w:proofErr w:type="gramEnd"/>
-      <w:r>
-        <w:t xml:space="preserve"> учебное пособие / А. М. Новиков, Д. А. Новиков. — </w:t>
+      <w:r>
+        <w:t>исследования:</w:t>
+      </w:r>
+      <w:r>
+        <w:t xml:space="preserve"> учебное пособие / А. М. Новиков, Д. А. Новиков. </w:t>
+      </w:r>
+      <w:r>
+        <w:t>–</w:t>
+      </w:r>
+      <w:r>
+        <w:t xml:space="preserve"> </w:t>
       </w:r>
       <w:proofErr w:type="gramStart"/>
       <w:r>
@@ -416,7 +499,7 @@
       <w:lvlText w:val="%1."/>
       <w:lvlJc w:val="left"/>
       <w:pPr>
-        <w:ind w:left="1070" w:hanging="360"/>
+        <w:ind w:left="4897" w:hanging="360"/>
       </w:pPr>
     </w:lvl>
     <w:lvl w:ilvl="1" w:tplc="04190019">
@@ -425,7 +508,7 @@
       <w:lvlText w:val="%2."/>
       <w:lvlJc w:val="left"/>
       <w:pPr>
-        <w:ind w:left="1790" w:hanging="360"/>
+        <w:ind w:left="5617" w:hanging="360"/>
       </w:pPr>
     </w:lvl>
     <w:lvl w:ilvl="2" w:tplc="0419001B" w:tentative="1">
@@ -434,7 +517,7 @@
       <w:lvlText w:val="%3."/>
       <w:lvlJc w:val="right"/>
       <w:pPr>
-        <w:ind w:left="2510" w:hanging="180"/>
+        <w:ind w:left="6337" w:hanging="180"/>
       </w:pPr>
     </w:lvl>
     <w:lvl w:ilvl="3" w:tplc="0419000F" w:tentative="1">
@@ -443,7 +526,7 @@
       <w:lvlText w:val="%4."/>
       <w:lvlJc w:val="left"/>
       <w:pPr>
-        <w:ind w:left="3230" w:hanging="360"/>
+        <w:ind w:left="7057" w:hanging="360"/>
       </w:pPr>
     </w:lvl>
     <w:lvl w:ilvl="4" w:tplc="04190019" w:tentative="1">
@@ -452,7 +535,7 @@
       <w:lvlText w:val="%5."/>
       <w:lvlJc w:val="left"/>
       <w:pPr>
-        <w:ind w:left="3950" w:hanging="360"/>
+        <w:ind w:left="7777" w:hanging="360"/>
       </w:pPr>
     </w:lvl>
     <w:lvl w:ilvl="5" w:tplc="0419001B" w:tentative="1">
@@ -461,7 +544,7 @@
       <w:lvlText w:val="%6."/>
       <w:lvlJc w:val="right"/>
       <w:pPr>
-        <w:ind w:left="4670" w:hanging="180"/>
+        <w:ind w:left="8497" w:hanging="180"/>
       </w:pPr>
     </w:lvl>
     <w:lvl w:ilvl="6" w:tplc="0419000F" w:tentative="1">
@@ -470,7 +553,7 @@
       <w:lvlText w:val="%7."/>
       <w:lvlJc w:val="left"/>
       <w:pPr>
-        <w:ind w:left="5390" w:hanging="360"/>
+        <w:ind w:left="9217" w:hanging="360"/>
       </w:pPr>
     </w:lvl>
     <w:lvl w:ilvl="7" w:tplc="04190019" w:tentative="1">
@@ -479,7 +562,7 @@
       <w:lvlText w:val="%8."/>
       <w:lvlJc w:val="left"/>
       <w:pPr>
-        <w:ind w:left="6110" w:hanging="360"/>
+        <w:ind w:left="9937" w:hanging="360"/>
       </w:pPr>
     </w:lvl>
     <w:lvl w:ilvl="8" w:tplc="0419001B" w:tentative="1">
@@ -488,7 +571,7 @@
       <w:lvlText w:val="%9."/>
       <w:lvlJc w:val="right"/>
       <w:pPr>
-        <w:ind w:left="6830" w:hanging="180"/>
+        <w:ind w:left="10657" w:hanging="180"/>
       </w:pPr>
     </w:lvl>
   </w:abstractNum>
@@ -1217,52 +1300,52 @@
       </w:rPr>
     </w:lvl>
   </w:abstractNum>
-  <w:num w:numId="1" w16cid:durableId="114255887">
+  <w:num w:numId="1" w16cid:durableId="1809201997">
     <w:abstractNumId w:val="7"/>
   </w:num>
-  <w:num w:numId="2" w16cid:durableId="1618871587">
+  <w:num w:numId="2" w16cid:durableId="81221862">
     <w:abstractNumId w:val="0"/>
   </w:num>
-  <w:num w:numId="3" w16cid:durableId="514150123">
+  <w:num w:numId="3" w16cid:durableId="2054840280">
     <w:abstractNumId w:val="8"/>
   </w:num>
-  <w:num w:numId="4" w16cid:durableId="135950274">
+  <w:num w:numId="4" w16cid:durableId="439033713">
     <w:abstractNumId w:val="2"/>
   </w:num>
-  <w:num w:numId="5" w16cid:durableId="1690447019">
+  <w:num w:numId="5" w16cid:durableId="749741427">
     <w:abstractNumId w:val="1"/>
   </w:num>
-  <w:num w:numId="6" w16cid:durableId="1914074192">
+  <w:num w:numId="6" w16cid:durableId="1939754237">
     <w:abstractNumId w:val="5"/>
   </w:num>
-  <w:num w:numId="7" w16cid:durableId="1103115874">
+  <w:num w:numId="7" w16cid:durableId="252737785">
     <w:abstractNumId w:val="3"/>
   </w:num>
-  <w:num w:numId="8" w16cid:durableId="1608847642">
+  <w:num w:numId="8" w16cid:durableId="773522364">
     <w:abstractNumId w:val="4"/>
   </w:num>
-  <w:num w:numId="9" w16cid:durableId="1186091628">
+  <w:num w:numId="9" w16cid:durableId="1363483125">
     <w:abstractNumId w:val="2"/>
     <w:lvlOverride w:ilvl="0">
       <w:startOverride w:val="1"/>
     </w:lvlOverride>
   </w:num>
-  <w:num w:numId="10" w16cid:durableId="2033531001">
+  <w:num w:numId="10" w16cid:durableId="345446074">
     <w:abstractNumId w:val="2"/>
     <w:lvlOverride w:ilvl="0">
       <w:startOverride w:val="1"/>
     </w:lvlOverride>
   </w:num>
-  <w:num w:numId="11" w16cid:durableId="1021199205">
+  <w:num w:numId="11" w16cid:durableId="1446266010">
     <w:abstractNumId w:val="6"/>
   </w:num>
-  <w:num w:numId="12" w16cid:durableId="576404702">
+  <w:num w:numId="12" w16cid:durableId="1551959469">
     <w:abstractNumId w:val="2"/>
     <w:lvlOverride w:ilvl="0">
       <w:startOverride w:val="1"/>
     </w:lvlOverride>
   </w:num>
-  <w:num w:numId="13" w16cid:durableId="215971861">
+  <w:num w:numId="13" w16cid:durableId="2104375800">
     <w:abstractNumId w:val="6"/>
     <w:lvlOverride w:ilvl="0">
       <w:startOverride w:val="1"/>
@@ -1274,7 +1357,7 @@
       <w:startOverride w:val="1"/>
     </w:lvlOverride>
   </w:num>
-  <w:num w:numId="14" w16cid:durableId="741833404">
+  <w:num w:numId="14" w16cid:durableId="247347205">
     <w:abstractNumId w:val="6"/>
     <w:lvlOverride w:ilvl="0">
       <w:startOverride w:val="1"/>
@@ -1286,7 +1369,7 @@
       <w:startOverride w:val="2"/>
     </w:lvlOverride>
   </w:num>
-  <w:num w:numId="15" w16cid:durableId="226376744">
+  <w:num w:numId="15" w16cid:durableId="1366439567">
     <w:abstractNumId w:val="6"/>
     <w:lvlOverride w:ilvl="0">
       <w:startOverride w:val="1"/>
@@ -1298,7 +1381,7 @@
       <w:startOverride w:val="2"/>
     </w:lvlOverride>
   </w:num>
-  <w:num w:numId="16" w16cid:durableId="247735232">
+  <w:num w:numId="16" w16cid:durableId="915632154">
     <w:abstractNumId w:val="2"/>
     <w:lvlOverride w:ilvl="0">
       <w:startOverride w:val="1"/>
@@ -1826,6 +1909,7 @@
   <w:style w:type="character" w:default="1" w:styleId="a2">
     <w:name w:val="Default Paragraph Font"/>
     <w:uiPriority w:val="1"/>
+    <w:semiHidden/>
     <w:unhideWhenUsed/>
   </w:style>
   <w:style w:type="table" w:default="1" w:styleId="a3">

</xml_diff>

<commit_message>
Added the 2.2 text and reworked1.1 and 1.2
</commit_message>
<xml_diff>
--- a/ППННИР/1.1 Логика.docx
+++ b/ППННИР/1.1 Логика.docx
@@ -1,6 +1,6 @@
 
 <file path=word/document.xml><?xml version="1.0" encoding="utf-8"?>
-<w:document xmlns:wpc="http://schemas.microsoft.com/office/word/2010/wordprocessingCanvas" xmlns:cx="http://schemas.microsoft.com/office/drawing/2014/chartex" xmlns:cx1="http://schemas.microsoft.com/office/drawing/2015/9/8/chartex" xmlns:cx2="http://schemas.microsoft.com/office/drawing/2015/10/21/chartex" xmlns:cx3="http://schemas.microsoft.com/office/drawing/2016/5/9/chartex" xmlns:cx4="http://schemas.microsoft.com/office/drawing/2016/5/10/chartex" xmlns:cx5="http://schemas.microsoft.com/office/drawing/2016/5/11/chartex" xmlns:cx6="http://schemas.microsoft.com/office/drawing/2016/5/12/chartex" xmlns:cx7="http://schemas.microsoft.com/office/drawing/2016/5/13/chartex" xmlns:cx8="http://schemas.microsoft.com/office/drawing/2016/5/14/chartex" xmlns:mc="http://schemas.openxmlformats.org/markup-compatibility/2006" xmlns:aink="http://schemas.microsoft.com/office/drawing/2016/ink" xmlns:am3d="http://schemas.microsoft.com/office/drawing/2017/model3d" xmlns:o="urn:schemas-microsoft-com:office:office" xmlns:r="http://schemas.openxmlformats.org/officeDocument/2006/relationships" xmlns:m="http://schemas.openxmlformats.org/officeDocument/2006/math" xmlns:v="urn:schemas-microsoft-com:vml" xmlns:wp14="http://schemas.microsoft.com/office/word/2010/wordprocessingDrawing" xmlns:wp="http://schemas.openxmlformats.org/drawingml/2006/wordprocessingDrawing" xmlns:w10="urn:schemas-microsoft-com:office:word" xmlns:w="http://schemas.openxmlformats.org/wordprocessingml/2006/main" xmlns:w14="http://schemas.microsoft.com/office/word/2010/wordml" xmlns:w15="http://schemas.microsoft.com/office/word/2012/wordml" xmlns:w16cex="http://schemas.microsoft.com/office/word/2018/wordml/cex" xmlns:w16cid="http://schemas.microsoft.com/office/word/2016/wordml/cid" xmlns:w16="http://schemas.microsoft.com/office/word/2018/wordml" xmlns:w16sdtdh="http://schemas.microsoft.com/office/word/2020/wordml/sdtdatahash" xmlns:w16se="http://schemas.microsoft.com/office/word/2015/wordml/symex" xmlns:wpg="http://schemas.microsoft.com/office/word/2010/wordprocessingGroup" xmlns:wpi="http://schemas.microsoft.com/office/word/2010/wordprocessingInk" xmlns:wne="http://schemas.microsoft.com/office/word/2006/wordml" xmlns:wps="http://schemas.microsoft.com/office/word/2010/wordprocessingShape" mc:Ignorable="w14 w15 w16se w16cid w16 w16cex w16sdtdh wp14">
+<w:document xmlns:wpc="http://schemas.microsoft.com/office/word/2010/wordprocessingCanvas" xmlns:cx="http://schemas.microsoft.com/office/drawing/2014/chartex" xmlns:cx1="http://schemas.microsoft.com/office/drawing/2015/9/8/chartex" xmlns:cx2="http://schemas.microsoft.com/office/drawing/2015/10/21/chartex" xmlns:cx3="http://schemas.microsoft.com/office/drawing/2016/5/9/chartex" xmlns:cx4="http://schemas.microsoft.com/office/drawing/2016/5/10/chartex" xmlns:cx5="http://schemas.microsoft.com/office/drawing/2016/5/11/chartex" xmlns:cx6="http://schemas.microsoft.com/office/drawing/2016/5/12/chartex" xmlns:cx7="http://schemas.microsoft.com/office/drawing/2016/5/13/chartex" xmlns:cx8="http://schemas.microsoft.com/office/drawing/2016/5/14/chartex" xmlns:mc="http://schemas.openxmlformats.org/markup-compatibility/2006" xmlns:aink="http://schemas.microsoft.com/office/drawing/2016/ink" xmlns:am3d="http://schemas.microsoft.com/office/drawing/2017/model3d" xmlns:o="urn:schemas-microsoft-com:office:office" xmlns:oel="http://schemas.microsoft.com/office/2019/extlst" xmlns:r="http://schemas.openxmlformats.org/officeDocument/2006/relationships" xmlns:m="http://schemas.openxmlformats.org/officeDocument/2006/math" xmlns:v="urn:schemas-microsoft-com:vml" xmlns:wp14="http://schemas.microsoft.com/office/word/2010/wordprocessingDrawing" xmlns:wp="http://schemas.openxmlformats.org/drawingml/2006/wordprocessingDrawing" xmlns:w10="urn:schemas-microsoft-com:office:word" xmlns:w="http://schemas.openxmlformats.org/wordprocessingml/2006/main" xmlns:w14="http://schemas.microsoft.com/office/word/2010/wordml" xmlns:w15="http://schemas.microsoft.com/office/word/2012/wordml" xmlns:w16cex="http://schemas.microsoft.com/office/word/2018/wordml/cex" xmlns:w16cid="http://schemas.microsoft.com/office/word/2016/wordml/cid" xmlns:w16="http://schemas.microsoft.com/office/word/2018/wordml" xmlns:w16sdtdh="http://schemas.microsoft.com/office/word/2020/wordml/sdtdatahash" xmlns:w16se="http://schemas.microsoft.com/office/word/2015/wordml/symex" xmlns:wpg="http://schemas.microsoft.com/office/word/2010/wordprocessingGroup" xmlns:wpi="http://schemas.microsoft.com/office/word/2010/wordprocessingInk" xmlns:wne="http://schemas.microsoft.com/office/word/2006/wordml" xmlns:wps="http://schemas.microsoft.com/office/word/2010/wordprocessingShape" mc:Ignorable="w14 w15 w16se w16cid w16 w16cex w16sdtdh wp14">
   <w:body>
     <w:p>
       <w:pPr>
@@ -47,217 +47,40 @@
       </w:r>
     </w:p>
     <w:p>
-      <w:pPr>
-        <w:pStyle w:val="a0"/>
-        <w:numPr>
-          <w:ilvl w:val="0"/>
-          <w:numId w:val="0"/>
-        </w:numPr>
-        <w:ind w:firstLine="709"/>
-      </w:pPr>
-      <w:r>
-        <w:t>Проектирование</w:t>
-      </w:r>
-      <w:r>
-        <w:t xml:space="preserve"> начинается с </w:t>
-      </w:r>
-      <w:r>
-        <w:t>определени</w:t>
-      </w:r>
-      <w:r>
-        <w:t>я</w:t>
-      </w:r>
-      <w:r>
-        <w:t xml:space="preserve"> проблемы,</w:t>
-      </w:r>
-      <w:r>
-        <w:t xml:space="preserve"> понимаемой как «знание о незнании», то есть осознание того, чего именно не </w:t>
-      </w:r>
-      <w:r>
-        <w:rPr>
-          <w:highlight w:val="yellow"/>
-        </w:rPr>
-        <w:t>хватает науке</w:t>
-      </w:r>
-      <w:r>
-        <w:rPr>
-          <w:highlight w:val="yellow"/>
-        </w:rPr>
+      <w:r>
+        <w:t>Фаза проектирования начинается с определения проблемы, понимаемой как «знание о незнании», то есть осознание того, чего именно не хватает науке</w:t>
+      </w:r>
+      <w:r>
         <w:t> </w:t>
       </w:r>
       <w:r>
-        <w:rPr>
-          <w:highlight w:val="yellow"/>
-        </w:rPr>
-        <w:t>[1]</w:t>
-      </w:r>
-      <w:r>
-        <w:rPr>
-          <w:highlight w:val="yellow"/>
-        </w:rPr>
-        <w:t>.</w:t>
-      </w:r>
-      <w:r>
-        <w:t xml:space="preserve"> </w:t>
-      </w:r>
-      <w:r>
-        <w:t xml:space="preserve">Что затем позволяет сфокусироваться на исследовании </w:t>
-      </w:r>
-      <w:r>
-        <w:t>объект</w:t>
-      </w:r>
-      <w:r>
-        <w:t>а</w:t>
-      </w:r>
-      <w:r>
-        <w:t>,</w:t>
-      </w:r>
-      <w:r>
-        <w:t xml:space="preserve"> то есть процесс</w:t>
-      </w:r>
-      <w:r>
-        <w:t>е</w:t>
-      </w:r>
-      <w:r>
-        <w:t xml:space="preserve"> или явлени</w:t>
-      </w:r>
-      <w:r>
-        <w:t>и</w:t>
-      </w:r>
-      <w:r>
-        <w:t xml:space="preserve">, порождающее проблемную ситуацию. </w:t>
-      </w:r>
-      <w:r>
-        <w:t>Анализ объекта позволяет определить п</w:t>
-      </w:r>
-      <w:r>
-        <w:rPr>
-          <w:highlight w:val="yellow"/>
-        </w:rPr>
-        <w:t>редмет</w:t>
-      </w:r>
-      <w:r>
-        <w:t>, что</w:t>
-      </w:r>
-      <w:r>
-        <w:t xml:space="preserve"> является уже </w:t>
-      </w:r>
-      <w:r>
-        <w:t>конкретным свойством, служащим источником выводов</w:t>
-      </w:r>
-      <w:r>
-        <w:t>. На основании этого</w:t>
-      </w:r>
-      <w:r>
-        <w:t xml:space="preserve"> задаются </w:t>
-      </w:r>
-      <w:r>
-        <w:rPr>
-          <w:highlight w:val="yellow"/>
-        </w:rPr>
-        <w:t>цели исследования</w:t>
-      </w:r>
-      <w:r>
-        <w:rPr>
-          <w:highlight w:val="yellow"/>
-        </w:rPr>
-        <w:t>, обо</w:t>
-      </w:r>
-      <w:r>
-        <w:t>значающие предположительный результат, для достижения которого</w:t>
-      </w:r>
-      <w:r>
-        <w:t xml:space="preserve"> </w:t>
-      </w:r>
-      <w:r>
-        <w:t>выдвигаются</w:t>
-      </w:r>
-      <w:r>
-        <w:t xml:space="preserve"> гипотезы</w:t>
-      </w:r>
-      <w:r>
-        <w:t>, то есть научные предположения, объясняющие явления, систематизирующие факты</w:t>
-      </w:r>
-      <w:r>
-        <w:t xml:space="preserve">. </w:t>
-      </w:r>
-      <w:r>
-        <w:t>Выдвижение гипотезы проходит в три этапа: накопление фактов и выдвижение допущений, их обоснование и, заключительно, выдвижение гипотезы. Если практически она подтверждается, то она превращается в научное знание, иначе отвергается.</w:t>
-      </w:r>
-      <w:r>
-        <w:t xml:space="preserve"> </w:t>
+        <w:t>[1]. Это позволяет затем сфокусироваться на исследовании объекта – процесса или явления, порождающего проблемную ситуацию. Анализ объекта позволяет определить предмет, что является уже конкретным свойством, служащим источником выводов. На основании этого задаются цели исследования, обозначающие предположительный результат, для достижения которого выдвигаются гипотезы, то есть научные предположения, объясняющие явления, систематизирующие факты. Выдвижение гипотезы проходит в три этапа: накопление фактов и выдвижение допущений, их обоснование и, заключительно, выдвижение гипотезы. Гипотеза служит своеобразным компасом исследования, определяя направление дальнейшей работы и критерии оценки результатов</w:t>
+      </w:r>
+      <w:r>
+        <w:t>, е</w:t>
+      </w:r>
+      <w:r>
+        <w:t>сли практически она подтверждается, то она превращается в научное знание, иначе отвергается.</w:t>
       </w:r>
     </w:p>
     <w:p>
-      <w:pPr>
-        <w:pStyle w:val="a0"/>
-        <w:numPr>
-          <w:ilvl w:val="0"/>
-          <w:numId w:val="0"/>
-        </w:numPr>
-        <w:ind w:firstLine="709"/>
-      </w:pPr>
-      <w:r>
-        <w:rPr>
-          <w:highlight w:val="yellow"/>
-        </w:rPr>
-        <w:t>Технологическая:</w:t>
-      </w:r>
-      <w:r>
-        <w:t xml:space="preserve"> сбор, систематизация, анализ данных о подходах </w:t>
-      </w:r>
-      <w:r>
-        <w:rPr>
-          <w:highlight w:val="yellow"/>
-        </w:rPr>
-        <w:t>реализации облачных хранилищ</w:t>
-      </w:r>
-      <w:r>
-        <w:t>, определяется их эффективность, уязвимость, надежность.</w:t>
-      </w:r>
-      <w:r>
-        <w:t xml:space="preserve"> </w:t>
-      </w:r>
-      <w:r>
-        <w:rPr>
-          <w:highlight w:val="yellow"/>
-        </w:rPr>
-        <w:t>Подразумевается всестороннее изучение подходов к реализации продукта: оценивание архитектуры, эффективности работы, показателей надёжности и потенциальных уязвимостей путём практических методов, используя различные методики для получения первичных данных</w:t>
-      </w:r>
-      <w:r>
-        <w:t xml:space="preserve">. </w:t>
+      <w:r>
+        <w:t xml:space="preserve">На технологической фазе происходит непосредственная работа с эмпирическим материалом: сбор, систематизация и анализ данных об объекте исследования. Подразумевается всестороннее изучение различных подходов к решению поставленной проблемы: оценивание архитектуры, эффективности работы, показателей надёжности и потенциальных уязвимостей путём </w:t>
       </w:r>
       <w:r>
         <w:lastRenderedPageBreak/>
-        <w:t>Результатом являются достоверные результаты, служащие основанием для подтверждения или опровержения гипотезы.</w:t>
+        <w:t>практических методов, используя различные методики для получения первичных данных. Результатом являются достоверные результаты, служащие основанием для подтверждения или опровержения гипотезы.</w:t>
       </w:r>
     </w:p>
     <w:p>
-      <w:pPr>
-        <w:pStyle w:val="a0"/>
-        <w:numPr>
-          <w:ilvl w:val="0"/>
-          <w:numId w:val="0"/>
-        </w:numPr>
-        <w:ind w:firstLine="709"/>
-      </w:pPr>
-      <w:r>
-        <w:t xml:space="preserve">Рефлексивная: оценивание полученных сведений, формирование выводов и рекомендаций </w:t>
-      </w:r>
-      <w:r>
-        <w:rPr>
-          <w:highlight w:val="yellow"/>
-        </w:rPr>
-        <w:t>касаемо развития облачных технологий</w:t>
-      </w:r>
-      <w:r>
-        <w:t xml:space="preserve">. </w:t>
-      </w:r>
-      <w:r>
-        <w:t xml:space="preserve">На данном этапе проводятся анализ, устанавливающий, достигнута ли цель работы, </w:t>
-      </w:r>
-      <w:r>
-        <w:t xml:space="preserve">подтверждена ли гипотеза, соответствие выводов к поставленной цели. </w:t>
+      <w:r>
+        <w:t xml:space="preserve">Завершающая </w:t>
+      </w:r>
+      <w:r>
+        <w:t xml:space="preserve">- </w:t>
+      </w:r>
+      <w:r>
+        <w:t>рефлексивная фаза посвящена оцениванию полученных сведений, формированию выводов и рекомендаций. На данном этапе проводятся анализ, устанавливающий, достигнута ли цель работы, подтверждена ли гипотеза, соответствие выводов к поставленной цели.</w:t>
       </w:r>
     </w:p>
     <w:p>
@@ -345,7 +168,7 @@
 </file>
 
 <file path=word/endnotes.xml><?xml version="1.0" encoding="utf-8"?>
-<w:endnotes xmlns:wpc="http://schemas.microsoft.com/office/word/2010/wordprocessingCanvas" xmlns:cx="http://schemas.microsoft.com/office/drawing/2014/chartex" xmlns:cx1="http://schemas.microsoft.com/office/drawing/2015/9/8/chartex" xmlns:cx2="http://schemas.microsoft.com/office/drawing/2015/10/21/chartex" xmlns:cx3="http://schemas.microsoft.com/office/drawing/2016/5/9/chartex" xmlns:cx4="http://schemas.microsoft.com/office/drawing/2016/5/10/chartex" xmlns:cx5="http://schemas.microsoft.com/office/drawing/2016/5/11/chartex" xmlns:cx6="http://schemas.microsoft.com/office/drawing/2016/5/12/chartex" xmlns:cx7="http://schemas.microsoft.com/office/drawing/2016/5/13/chartex" xmlns:cx8="http://schemas.microsoft.com/office/drawing/2016/5/14/chartex" xmlns:mc="http://schemas.openxmlformats.org/markup-compatibility/2006" xmlns:aink="http://schemas.microsoft.com/office/drawing/2016/ink" xmlns:am3d="http://schemas.microsoft.com/office/drawing/2017/model3d" xmlns:o="urn:schemas-microsoft-com:office:office" xmlns:r="http://schemas.openxmlformats.org/officeDocument/2006/relationships" xmlns:m="http://schemas.openxmlformats.org/officeDocument/2006/math" xmlns:v="urn:schemas-microsoft-com:vml" xmlns:wp14="http://schemas.microsoft.com/office/word/2010/wordprocessingDrawing" xmlns:wp="http://schemas.openxmlformats.org/drawingml/2006/wordprocessingDrawing" xmlns:w10="urn:schemas-microsoft-com:office:word" xmlns:w="http://schemas.openxmlformats.org/wordprocessingml/2006/main" xmlns:w14="http://schemas.microsoft.com/office/word/2010/wordml" xmlns:w15="http://schemas.microsoft.com/office/word/2012/wordml" xmlns:w16cex="http://schemas.microsoft.com/office/word/2018/wordml/cex" xmlns:w16cid="http://schemas.microsoft.com/office/word/2016/wordml/cid" xmlns:w16="http://schemas.microsoft.com/office/word/2018/wordml" xmlns:w16sdtdh="http://schemas.microsoft.com/office/word/2020/wordml/sdtdatahash" xmlns:w16se="http://schemas.microsoft.com/office/word/2015/wordml/symex" xmlns:wpg="http://schemas.microsoft.com/office/word/2010/wordprocessingGroup" xmlns:wpi="http://schemas.microsoft.com/office/word/2010/wordprocessingInk" xmlns:wne="http://schemas.microsoft.com/office/word/2006/wordml" xmlns:wps="http://schemas.microsoft.com/office/word/2010/wordprocessingShape" mc:Ignorable="w14 w15 w16se w16cid w16 w16cex w16sdtdh wp14">
+<w:endnotes xmlns:wpc="http://schemas.microsoft.com/office/word/2010/wordprocessingCanvas" xmlns:cx="http://schemas.microsoft.com/office/drawing/2014/chartex" xmlns:cx1="http://schemas.microsoft.com/office/drawing/2015/9/8/chartex" xmlns:cx2="http://schemas.microsoft.com/office/drawing/2015/10/21/chartex" xmlns:cx3="http://schemas.microsoft.com/office/drawing/2016/5/9/chartex" xmlns:cx4="http://schemas.microsoft.com/office/drawing/2016/5/10/chartex" xmlns:cx5="http://schemas.microsoft.com/office/drawing/2016/5/11/chartex" xmlns:cx6="http://schemas.microsoft.com/office/drawing/2016/5/12/chartex" xmlns:cx7="http://schemas.microsoft.com/office/drawing/2016/5/13/chartex" xmlns:cx8="http://schemas.microsoft.com/office/drawing/2016/5/14/chartex" xmlns:mc="http://schemas.openxmlformats.org/markup-compatibility/2006" xmlns:aink="http://schemas.microsoft.com/office/drawing/2016/ink" xmlns:am3d="http://schemas.microsoft.com/office/drawing/2017/model3d" xmlns:o="urn:schemas-microsoft-com:office:office" xmlns:oel="http://schemas.microsoft.com/office/2019/extlst" xmlns:r="http://schemas.openxmlformats.org/officeDocument/2006/relationships" xmlns:m="http://schemas.openxmlformats.org/officeDocument/2006/math" xmlns:v="urn:schemas-microsoft-com:vml" xmlns:wp14="http://schemas.microsoft.com/office/word/2010/wordprocessingDrawing" xmlns:wp="http://schemas.openxmlformats.org/drawingml/2006/wordprocessingDrawing" xmlns:w10="urn:schemas-microsoft-com:office:word" xmlns:w="http://schemas.openxmlformats.org/wordprocessingml/2006/main" xmlns:w14="http://schemas.microsoft.com/office/word/2010/wordml" xmlns:w15="http://schemas.microsoft.com/office/word/2012/wordml" xmlns:w16cex="http://schemas.microsoft.com/office/word/2018/wordml/cex" xmlns:w16cid="http://schemas.microsoft.com/office/word/2016/wordml/cid" xmlns:w16="http://schemas.microsoft.com/office/word/2018/wordml" xmlns:w16sdtdh="http://schemas.microsoft.com/office/word/2020/wordml/sdtdatahash" xmlns:w16se="http://schemas.microsoft.com/office/word/2015/wordml/symex" xmlns:wpg="http://schemas.microsoft.com/office/word/2010/wordprocessingGroup" xmlns:wpi="http://schemas.microsoft.com/office/word/2010/wordprocessingInk" xmlns:wne="http://schemas.microsoft.com/office/word/2006/wordml" xmlns:wps="http://schemas.microsoft.com/office/word/2010/wordprocessingShape" mc:Ignorable="w14 w15 w16se w16cid w16 w16cex w16sdtdh wp14">
   <w:endnote w:type="separator" w:id="-1">
     <w:p>
       <w:pPr>
@@ -370,7 +193,7 @@
 </file>
 
 <file path=word/footer1.xml><?xml version="1.0" encoding="utf-8"?>
-<w:ftr xmlns:wpc="http://schemas.microsoft.com/office/word/2010/wordprocessingCanvas" xmlns:cx="http://schemas.microsoft.com/office/drawing/2014/chartex" xmlns:cx1="http://schemas.microsoft.com/office/drawing/2015/9/8/chartex" xmlns:cx2="http://schemas.microsoft.com/office/drawing/2015/10/21/chartex" xmlns:cx3="http://schemas.microsoft.com/office/drawing/2016/5/9/chartex" xmlns:cx4="http://schemas.microsoft.com/office/drawing/2016/5/10/chartex" xmlns:cx5="http://schemas.microsoft.com/office/drawing/2016/5/11/chartex" xmlns:cx6="http://schemas.microsoft.com/office/drawing/2016/5/12/chartex" xmlns:cx7="http://schemas.microsoft.com/office/drawing/2016/5/13/chartex" xmlns:cx8="http://schemas.microsoft.com/office/drawing/2016/5/14/chartex" xmlns:mc="http://schemas.openxmlformats.org/markup-compatibility/2006" xmlns:aink="http://schemas.microsoft.com/office/drawing/2016/ink" xmlns:am3d="http://schemas.microsoft.com/office/drawing/2017/model3d" xmlns:o="urn:schemas-microsoft-com:office:office" xmlns:r="http://schemas.openxmlformats.org/officeDocument/2006/relationships" xmlns:m="http://schemas.openxmlformats.org/officeDocument/2006/math" xmlns:v="urn:schemas-microsoft-com:vml" xmlns:wp14="http://schemas.microsoft.com/office/word/2010/wordprocessingDrawing" xmlns:wp="http://schemas.openxmlformats.org/drawingml/2006/wordprocessingDrawing" xmlns:w10="urn:schemas-microsoft-com:office:word" xmlns:w="http://schemas.openxmlformats.org/wordprocessingml/2006/main" xmlns:w14="http://schemas.microsoft.com/office/word/2010/wordml" xmlns:w15="http://schemas.microsoft.com/office/word/2012/wordml" xmlns:w16cex="http://schemas.microsoft.com/office/word/2018/wordml/cex" xmlns:w16cid="http://schemas.microsoft.com/office/word/2016/wordml/cid" xmlns:w16="http://schemas.microsoft.com/office/word/2018/wordml" xmlns:w16sdtdh="http://schemas.microsoft.com/office/word/2020/wordml/sdtdatahash" xmlns:w16se="http://schemas.microsoft.com/office/word/2015/wordml/symex" xmlns:wpg="http://schemas.microsoft.com/office/word/2010/wordprocessingGroup" xmlns:wpi="http://schemas.microsoft.com/office/word/2010/wordprocessingInk" xmlns:wne="http://schemas.microsoft.com/office/word/2006/wordml" xmlns:wps="http://schemas.microsoft.com/office/word/2010/wordprocessingShape" mc:Ignorable="w14 w15 w16se w16cid w16 w16cex w16sdtdh wp14">
+<w:ftr xmlns:wpc="http://schemas.microsoft.com/office/word/2010/wordprocessingCanvas" xmlns:cx="http://schemas.microsoft.com/office/drawing/2014/chartex" xmlns:cx1="http://schemas.microsoft.com/office/drawing/2015/9/8/chartex" xmlns:cx2="http://schemas.microsoft.com/office/drawing/2015/10/21/chartex" xmlns:cx3="http://schemas.microsoft.com/office/drawing/2016/5/9/chartex" xmlns:cx4="http://schemas.microsoft.com/office/drawing/2016/5/10/chartex" xmlns:cx5="http://schemas.microsoft.com/office/drawing/2016/5/11/chartex" xmlns:cx6="http://schemas.microsoft.com/office/drawing/2016/5/12/chartex" xmlns:cx7="http://schemas.microsoft.com/office/drawing/2016/5/13/chartex" xmlns:cx8="http://schemas.microsoft.com/office/drawing/2016/5/14/chartex" xmlns:mc="http://schemas.openxmlformats.org/markup-compatibility/2006" xmlns:aink="http://schemas.microsoft.com/office/drawing/2016/ink" xmlns:am3d="http://schemas.microsoft.com/office/drawing/2017/model3d" xmlns:o="urn:schemas-microsoft-com:office:office" xmlns:oel="http://schemas.microsoft.com/office/2019/extlst" xmlns:r="http://schemas.openxmlformats.org/officeDocument/2006/relationships" xmlns:m="http://schemas.openxmlformats.org/officeDocument/2006/math" xmlns:v="urn:schemas-microsoft-com:vml" xmlns:wp14="http://schemas.microsoft.com/office/word/2010/wordprocessingDrawing" xmlns:wp="http://schemas.openxmlformats.org/drawingml/2006/wordprocessingDrawing" xmlns:w10="urn:schemas-microsoft-com:office:word" xmlns:w="http://schemas.openxmlformats.org/wordprocessingml/2006/main" xmlns:w14="http://schemas.microsoft.com/office/word/2010/wordml" xmlns:w15="http://schemas.microsoft.com/office/word/2012/wordml" xmlns:w16cex="http://schemas.microsoft.com/office/word/2018/wordml/cex" xmlns:w16cid="http://schemas.microsoft.com/office/word/2016/wordml/cid" xmlns:w16="http://schemas.microsoft.com/office/word/2018/wordml" xmlns:w16sdtdh="http://schemas.microsoft.com/office/word/2020/wordml/sdtdatahash" xmlns:w16se="http://schemas.microsoft.com/office/word/2015/wordml/symex" xmlns:wpg="http://schemas.microsoft.com/office/word/2010/wordprocessingGroup" xmlns:wpi="http://schemas.microsoft.com/office/word/2010/wordprocessingInk" xmlns:wne="http://schemas.microsoft.com/office/word/2006/wordml" xmlns:wps="http://schemas.microsoft.com/office/word/2010/wordprocessingShape" mc:Ignorable="w14 w15 w16se w16cid w16 w16cex w16sdtdh wp14">
   <w:p>
     <w:pPr>
       <w:pStyle w:val="af3"/>
@@ -397,7 +220,7 @@
 </file>
 
 <file path=word/footnotes.xml><?xml version="1.0" encoding="utf-8"?>
-<w:footnotes xmlns:wpc="http://schemas.microsoft.com/office/word/2010/wordprocessingCanvas" xmlns:cx="http://schemas.microsoft.com/office/drawing/2014/chartex" xmlns:cx1="http://schemas.microsoft.com/office/drawing/2015/9/8/chartex" xmlns:cx2="http://schemas.microsoft.com/office/drawing/2015/10/21/chartex" xmlns:cx3="http://schemas.microsoft.com/office/drawing/2016/5/9/chartex" xmlns:cx4="http://schemas.microsoft.com/office/drawing/2016/5/10/chartex" xmlns:cx5="http://schemas.microsoft.com/office/drawing/2016/5/11/chartex" xmlns:cx6="http://schemas.microsoft.com/office/drawing/2016/5/12/chartex" xmlns:cx7="http://schemas.microsoft.com/office/drawing/2016/5/13/chartex" xmlns:cx8="http://schemas.microsoft.com/office/drawing/2016/5/14/chartex" xmlns:mc="http://schemas.openxmlformats.org/markup-compatibility/2006" xmlns:aink="http://schemas.microsoft.com/office/drawing/2016/ink" xmlns:am3d="http://schemas.microsoft.com/office/drawing/2017/model3d" xmlns:o="urn:schemas-microsoft-com:office:office" xmlns:r="http://schemas.openxmlformats.org/officeDocument/2006/relationships" xmlns:m="http://schemas.openxmlformats.org/officeDocument/2006/math" xmlns:v="urn:schemas-microsoft-com:vml" xmlns:wp14="http://schemas.microsoft.com/office/word/2010/wordprocessingDrawing" xmlns:wp="http://schemas.openxmlformats.org/drawingml/2006/wordprocessingDrawing" xmlns:w10="urn:schemas-microsoft-com:office:word" xmlns:w="http://schemas.openxmlformats.org/wordprocessingml/2006/main" xmlns:w14="http://schemas.microsoft.com/office/word/2010/wordml" xmlns:w15="http://schemas.microsoft.com/office/word/2012/wordml" xmlns:w16cex="http://schemas.microsoft.com/office/word/2018/wordml/cex" xmlns:w16cid="http://schemas.microsoft.com/office/word/2016/wordml/cid" xmlns:w16="http://schemas.microsoft.com/office/word/2018/wordml" xmlns:w16sdtdh="http://schemas.microsoft.com/office/word/2020/wordml/sdtdatahash" xmlns:w16se="http://schemas.microsoft.com/office/word/2015/wordml/symex" xmlns:wpg="http://schemas.microsoft.com/office/word/2010/wordprocessingGroup" xmlns:wpi="http://schemas.microsoft.com/office/word/2010/wordprocessingInk" xmlns:wne="http://schemas.microsoft.com/office/word/2006/wordml" xmlns:wps="http://schemas.microsoft.com/office/word/2010/wordprocessingShape" mc:Ignorable="w14 w15 w16se w16cid w16 w16cex w16sdtdh wp14">
+<w:footnotes xmlns:wpc="http://schemas.microsoft.com/office/word/2010/wordprocessingCanvas" xmlns:cx="http://schemas.microsoft.com/office/drawing/2014/chartex" xmlns:cx1="http://schemas.microsoft.com/office/drawing/2015/9/8/chartex" xmlns:cx2="http://schemas.microsoft.com/office/drawing/2015/10/21/chartex" xmlns:cx3="http://schemas.microsoft.com/office/drawing/2016/5/9/chartex" xmlns:cx4="http://schemas.microsoft.com/office/drawing/2016/5/10/chartex" xmlns:cx5="http://schemas.microsoft.com/office/drawing/2016/5/11/chartex" xmlns:cx6="http://schemas.microsoft.com/office/drawing/2016/5/12/chartex" xmlns:cx7="http://schemas.microsoft.com/office/drawing/2016/5/13/chartex" xmlns:cx8="http://schemas.microsoft.com/office/drawing/2016/5/14/chartex" xmlns:mc="http://schemas.openxmlformats.org/markup-compatibility/2006" xmlns:aink="http://schemas.microsoft.com/office/drawing/2016/ink" xmlns:am3d="http://schemas.microsoft.com/office/drawing/2017/model3d" xmlns:o="urn:schemas-microsoft-com:office:office" xmlns:oel="http://schemas.microsoft.com/office/2019/extlst" xmlns:r="http://schemas.openxmlformats.org/officeDocument/2006/relationships" xmlns:m="http://schemas.openxmlformats.org/officeDocument/2006/math" xmlns:v="urn:schemas-microsoft-com:vml" xmlns:wp14="http://schemas.microsoft.com/office/word/2010/wordprocessingDrawing" xmlns:wp="http://schemas.openxmlformats.org/drawingml/2006/wordprocessingDrawing" xmlns:w10="urn:schemas-microsoft-com:office:word" xmlns:w="http://schemas.openxmlformats.org/wordprocessingml/2006/main" xmlns:w14="http://schemas.microsoft.com/office/word/2010/wordml" xmlns:w15="http://schemas.microsoft.com/office/word/2012/wordml" xmlns:w16cex="http://schemas.microsoft.com/office/word/2018/wordml/cex" xmlns:w16cid="http://schemas.microsoft.com/office/word/2016/wordml/cid" xmlns:w16="http://schemas.microsoft.com/office/word/2018/wordml" xmlns:w16sdtdh="http://schemas.microsoft.com/office/word/2020/wordml/sdtdatahash" xmlns:w16se="http://schemas.microsoft.com/office/word/2015/wordml/symex" xmlns:wpg="http://schemas.microsoft.com/office/word/2010/wordprocessingGroup" xmlns:wpi="http://schemas.microsoft.com/office/word/2010/wordprocessingInk" xmlns:wne="http://schemas.microsoft.com/office/word/2006/wordml" xmlns:wps="http://schemas.microsoft.com/office/word/2010/wordprocessingShape" mc:Ignorable="w14 w15 w16se w16cid w16 w16cex w16sdtdh wp14">
   <w:footnote w:type="separator" w:id="-1">
     <w:p>
       <w:pPr>
@@ -422,7 +245,7 @@
 </file>
 
 <file path=word/numbering.xml><?xml version="1.0" encoding="utf-8"?>
-<w:numbering xmlns:wpc="http://schemas.microsoft.com/office/word/2010/wordprocessingCanvas" xmlns:cx="http://schemas.microsoft.com/office/drawing/2014/chartex" xmlns:cx1="http://schemas.microsoft.com/office/drawing/2015/9/8/chartex" xmlns:cx2="http://schemas.microsoft.com/office/drawing/2015/10/21/chartex" xmlns:cx3="http://schemas.microsoft.com/office/drawing/2016/5/9/chartex" xmlns:cx4="http://schemas.microsoft.com/office/drawing/2016/5/10/chartex" xmlns:cx5="http://schemas.microsoft.com/office/drawing/2016/5/11/chartex" xmlns:cx6="http://schemas.microsoft.com/office/drawing/2016/5/12/chartex" xmlns:cx7="http://schemas.microsoft.com/office/drawing/2016/5/13/chartex" xmlns:cx8="http://schemas.microsoft.com/office/drawing/2016/5/14/chartex" xmlns:mc="http://schemas.openxmlformats.org/markup-compatibility/2006" xmlns:aink="http://schemas.microsoft.com/office/drawing/2016/ink" xmlns:am3d="http://schemas.microsoft.com/office/drawing/2017/model3d" xmlns:o="urn:schemas-microsoft-com:office:office" xmlns:r="http://schemas.openxmlformats.org/officeDocument/2006/relationships" xmlns:m="http://schemas.openxmlformats.org/officeDocument/2006/math" xmlns:v="urn:schemas-microsoft-com:vml" xmlns:wp14="http://schemas.microsoft.com/office/word/2010/wordprocessingDrawing" xmlns:wp="http://schemas.openxmlformats.org/drawingml/2006/wordprocessingDrawing" xmlns:w10="urn:schemas-microsoft-com:office:word" xmlns:w="http://schemas.openxmlformats.org/wordprocessingml/2006/main" xmlns:w14="http://schemas.microsoft.com/office/word/2010/wordml" xmlns:w15="http://schemas.microsoft.com/office/word/2012/wordml" xmlns:w16cex="http://schemas.microsoft.com/office/word/2018/wordml/cex" xmlns:w16cid="http://schemas.microsoft.com/office/word/2016/wordml/cid" xmlns:w16="http://schemas.microsoft.com/office/word/2018/wordml" xmlns:w16sdtdh="http://schemas.microsoft.com/office/word/2020/wordml/sdtdatahash" xmlns:w16se="http://schemas.microsoft.com/office/word/2015/wordml/symex" xmlns:wpg="http://schemas.microsoft.com/office/word/2010/wordprocessingGroup" xmlns:wpi="http://schemas.microsoft.com/office/word/2010/wordprocessingInk" xmlns:wne="http://schemas.microsoft.com/office/word/2006/wordml" xmlns:wps="http://schemas.microsoft.com/office/word/2010/wordprocessingShape" mc:Ignorable="w14 w15 w16se w16cid w16 w16cex w16sdtdh wp14">
+<w:numbering xmlns:wpc="http://schemas.microsoft.com/office/word/2010/wordprocessingCanvas" xmlns:cx="http://schemas.microsoft.com/office/drawing/2014/chartex" xmlns:cx1="http://schemas.microsoft.com/office/drawing/2015/9/8/chartex" xmlns:cx2="http://schemas.microsoft.com/office/drawing/2015/10/21/chartex" xmlns:cx3="http://schemas.microsoft.com/office/drawing/2016/5/9/chartex" xmlns:cx4="http://schemas.microsoft.com/office/drawing/2016/5/10/chartex" xmlns:cx5="http://schemas.microsoft.com/office/drawing/2016/5/11/chartex" xmlns:cx6="http://schemas.microsoft.com/office/drawing/2016/5/12/chartex" xmlns:cx7="http://schemas.microsoft.com/office/drawing/2016/5/13/chartex" xmlns:cx8="http://schemas.microsoft.com/office/drawing/2016/5/14/chartex" xmlns:mc="http://schemas.openxmlformats.org/markup-compatibility/2006" xmlns:aink="http://schemas.microsoft.com/office/drawing/2016/ink" xmlns:am3d="http://schemas.microsoft.com/office/drawing/2017/model3d" xmlns:o="urn:schemas-microsoft-com:office:office" xmlns:oel="http://schemas.microsoft.com/office/2019/extlst" xmlns:r="http://schemas.openxmlformats.org/officeDocument/2006/relationships" xmlns:m="http://schemas.openxmlformats.org/officeDocument/2006/math" xmlns:v="urn:schemas-microsoft-com:vml" xmlns:wp14="http://schemas.microsoft.com/office/word/2010/wordprocessingDrawing" xmlns:wp="http://schemas.openxmlformats.org/drawingml/2006/wordprocessingDrawing" xmlns:w10="urn:schemas-microsoft-com:office:word" xmlns:w="http://schemas.openxmlformats.org/wordprocessingml/2006/main" xmlns:w14="http://schemas.microsoft.com/office/word/2010/wordml" xmlns:w15="http://schemas.microsoft.com/office/word/2012/wordml" xmlns:w16cex="http://schemas.microsoft.com/office/word/2018/wordml/cex" xmlns:w16cid="http://schemas.microsoft.com/office/word/2016/wordml/cid" xmlns:w16="http://schemas.microsoft.com/office/word/2018/wordml" xmlns:w16sdtdh="http://schemas.microsoft.com/office/word/2020/wordml/sdtdatahash" xmlns:w16se="http://schemas.microsoft.com/office/word/2015/wordml/symex" xmlns:wpg="http://schemas.microsoft.com/office/word/2010/wordprocessingGroup" xmlns:wpi="http://schemas.microsoft.com/office/word/2010/wordprocessingInk" xmlns:wne="http://schemas.microsoft.com/office/word/2006/wordml" xmlns:wps="http://schemas.microsoft.com/office/word/2010/wordprocessingShape" mc:Ignorable="w14 w15 w16se w16cid w16 w16cex w16sdtdh wp14">
   <w:abstractNum w:abstractNumId="0" w15:restartNumberingAfterBreak="0">
     <w:nsid w:val="1A3A658A"/>
     <w:multiLevelType w:val="hybridMultilevel"/>
@@ -1414,52 +1237,52 @@
       </w:rPr>
     </w:lvl>
   </w:abstractNum>
-  <w:num w:numId="1">
+  <w:num w:numId="1" w16cid:durableId="862091275">
     <w:abstractNumId w:val="7"/>
   </w:num>
-  <w:num w:numId="2">
+  <w:num w:numId="2" w16cid:durableId="1001157055">
     <w:abstractNumId w:val="0"/>
   </w:num>
-  <w:num w:numId="3">
+  <w:num w:numId="3" w16cid:durableId="820000679">
     <w:abstractNumId w:val="8"/>
   </w:num>
-  <w:num w:numId="4">
+  <w:num w:numId="4" w16cid:durableId="1510217106">
     <w:abstractNumId w:val="2"/>
   </w:num>
-  <w:num w:numId="5">
+  <w:num w:numId="5" w16cid:durableId="460614099">
     <w:abstractNumId w:val="1"/>
   </w:num>
-  <w:num w:numId="6">
+  <w:num w:numId="6" w16cid:durableId="449280439">
     <w:abstractNumId w:val="5"/>
   </w:num>
-  <w:num w:numId="7">
+  <w:num w:numId="7" w16cid:durableId="1274706069">
     <w:abstractNumId w:val="3"/>
   </w:num>
-  <w:num w:numId="8">
+  <w:num w:numId="8" w16cid:durableId="320624167">
     <w:abstractNumId w:val="4"/>
   </w:num>
-  <w:num w:numId="9">
+  <w:num w:numId="9" w16cid:durableId="901211110">
     <w:abstractNumId w:val="2"/>
     <w:lvlOverride w:ilvl="0">
       <w:startOverride w:val="1"/>
     </w:lvlOverride>
   </w:num>
-  <w:num w:numId="10">
+  <w:num w:numId="10" w16cid:durableId="833761705">
     <w:abstractNumId w:val="2"/>
     <w:lvlOverride w:ilvl="0">
       <w:startOverride w:val="1"/>
     </w:lvlOverride>
   </w:num>
-  <w:num w:numId="11">
+  <w:num w:numId="11" w16cid:durableId="1406609187">
     <w:abstractNumId w:val="6"/>
   </w:num>
-  <w:num w:numId="12">
+  <w:num w:numId="12" w16cid:durableId="692997019">
     <w:abstractNumId w:val="2"/>
     <w:lvlOverride w:ilvl="0">
       <w:startOverride w:val="1"/>
     </w:lvlOverride>
   </w:num>
-  <w:num w:numId="13">
+  <w:num w:numId="13" w16cid:durableId="614487093">
     <w:abstractNumId w:val="6"/>
     <w:lvlOverride w:ilvl="0">
       <w:startOverride w:val="1"/>
@@ -1471,7 +1294,7 @@
       <w:startOverride w:val="1"/>
     </w:lvlOverride>
   </w:num>
-  <w:num w:numId="14">
+  <w:num w:numId="14" w16cid:durableId="1182629660">
     <w:abstractNumId w:val="6"/>
     <w:lvlOverride w:ilvl="0">
       <w:startOverride w:val="1"/>
@@ -1483,7 +1306,7 @@
       <w:startOverride w:val="2"/>
     </w:lvlOverride>
   </w:num>
-  <w:num w:numId="15">
+  <w:num w:numId="15" w16cid:durableId="1752268042">
     <w:abstractNumId w:val="6"/>
     <w:lvlOverride w:ilvl="0">
       <w:startOverride w:val="1"/>
@@ -1495,7 +1318,7 @@
       <w:startOverride w:val="2"/>
     </w:lvlOverride>
   </w:num>
-  <w:num w:numId="16">
+  <w:num w:numId="16" w16cid:durableId="2127002151">
     <w:abstractNumId w:val="2"/>
     <w:lvlOverride w:ilvl="0">
       <w:startOverride w:val="1"/>
@@ -2023,7 +1846,6 @@
   <w:style w:type="character" w:default="1" w:styleId="a2">
     <w:name w:val="Default Paragraph Font"/>
     <w:uiPriority w:val="1"/>
-    <w:semiHidden/>
     <w:unhideWhenUsed/>
   </w:style>
   <w:style w:type="table" w:default="1" w:styleId="a3">

</xml_diff>